<commit_message>
Fix mixed resume contact validation
</commit_message>
<xml_diff>
--- a/tests/fixtures/synthetic-resume-contract-v5.docx
+++ b/tests/fixtures/synthetic-resume-contract-v5.docx
@@ -47,7 +47,21 @@
           <w:szCs w:val="21"/>
           <w:rFonts w:ascii="Arial" w:cs="Arial" w:eastAsia="Arial" w:hAnsi="Arial"/>
         </w:rPr>
-        <w:t xml:space="preserve">Location: Toronto, Canada | jordan@example.test | +1 (555) 010-1000</w:t>
+        <w:t xml:space="preserve">Riverton, CA | (555) 010-1000 | jordan@example.test</w:t>
+      </w:r>
+    </w:p>
+    <w:p>
+      <w:pPr>
+        <w:spacing w:before="0" w:after="0" w:line="240"/>
+        <w:jc w:val="center"/>
+      </w:pPr>
+      <w:r>
+        <w:rPr>
+          <w:sz w:val="21"/>
+          <w:szCs w:val="21"/>
+          <w:rFonts w:ascii="Arial" w:cs="Arial" w:eastAsia="Arial" w:hAnsi="Arial"/>
+        </w:rPr>
+        <w:t xml:space="preserve">https://portfolio.example.test/jordan | https://www.linkedin.com/in/jordan-example | https://github.com/jordan-example</w:t>
       </w:r>
     </w:p>
     <w:p>

</xml_diff>